<commit_message>
docs: benchmark justification — Part A reference mapping added. docs: benchmark justification — evidence embedded
</commit_message>
<xml_diff>
--- a/docs/minutes/SEDAS_Benchmark_Justification.docx
+++ b/docs/minutes/SEDAS_Benchmark_Justification.docx
@@ -433,7 +433,7 @@
           <w:sz w:val="28"/>
           <w:szCs w:val="28"/>
         </w:rPr>
-        <w:t xml:space="preserve">2. Source Paper (Benchmark)</w:t>
+        <w:t xml:space="preserve">2. Source Paper (Benchmark) — Exact Dataset Match</w:t>
       </w:r>
     </w:p>
     <w:p>
@@ -447,7 +447,7 @@
           <w:sz w:val="22"/>
           <w:szCs w:val="22"/>
         </w:rPr>
-        <w:t xml:space="preserve">The dataset was assembled and published by its authors together with a peer-reviewed study:</w:t>
+        <w:t xml:space="preserve">The dataset was assembled and published by its authors together with a peer-reviewed study, introduced here as reference [41], continuing the Part A reference register ([1]–[40]):</w:t>
       </w:r>
     </w:p>
     <w:p>
@@ -463,7 +463,7 @@
           <w:sz w:val="22"/>
           <w:szCs w:val="22"/>
         </w:rPr>
-        <w:t xml:space="preserve">Al-Subaiey, A., Al-Thani, M., Alam, N. A., Antora, K. F., Khandakar, A., &amp; Zaman, S. M. A. U. (2024). Novel interpretable and robust web-based AI platform for phishing email detection. Computers and Electrical Engineering, 120, 109625. (Preprint: arXiv:2405.11619.)</w:t>
+        <w:t xml:space="preserve">[41] Al-Subaiey, A., Al-Thani, M., Alam, N. A., Antora, K. F., Khandakar, A., &amp; Zaman, S. M. A. U. (2024). Novel interpretable and robust web-based AI platform for phishing email detection. Computers and Electrical Engineering, 120, 109625. (Preprint: arXiv:2405.11619.)</w:t>
       </w:r>
     </w:p>
     <w:p>
@@ -477,7 +477,7 @@
           <w:sz w:val="22"/>
           <w:szCs w:val="22"/>
         </w:rPr>
-        <w:t xml:space="preserve">Alignment with SEDAS is exact: the paper uses the identical combined corpus (42,891 spam / 39,595 ham ≈ 82,500 emails — matching our loaded 82,486 rows), TF-IDF feature extraction, a supervised classifier, Explainable AI for user trust (LIME), and deployment as a real-time web application for phishing email detection. This is the same problem, the same data, and a directly comparable pipeline to the SEDAS detection service.</w:t>
+        <w:t xml:space="preserve">The match with the SEDAS dataset is exact — [41] uses the identical combined corpus (42,891 spam / 39,595 ham ≈ 82,500 emails, matching our loaded 82,486 rows), TF-IDF feature extraction, a supervised classifier, Explainable AI for user trust (LIME), and deployment as a real-time web application for phishing email detection. This is the same problem, the same data, and a directly comparable pipeline to the SEDAS detection service.</w:t>
       </w:r>
     </w:p>
     <w:p>
@@ -1550,6 +1550,69 @@
     </w:p>
     <w:p>
       <w:pPr>
+        <w:spacing w:after="40" w:before="140"/>
+        <w:jc w:val="center"/>
+      </w:pPr>
+      <w:r>
+        <w:drawing>
+          <wp:inline distT="0" distB="0" distL="0" distR="0">
+            <wp:extent cx="4000500" cy="4705350"/>
+            <wp:effectExtent t="0" r="0" b="0" l="0"/>
+            <wp:docPr id="1" name="" descr="" title=""/>
+            <wp:cNvGraphicFramePr>
+              <a:graphicFrameLocks xmlns:a="http://schemas.openxmlformats.org/drawingml/2006/main" noChangeAspect="1"/>
+            </wp:cNvGraphicFramePr>
+            <a:graphic xmlns:a="http://schemas.openxmlformats.org/drawingml/2006/main">
+              <a:graphicData uri="http://schemas.openxmlformats.org/drawingml/2006/picture">
+                <pic:pic xmlns:pic="http://schemas.openxmlformats.org/drawingml/2006/picture">
+                  <pic:nvPicPr>
+                    <pic:cNvPr id="0" name="" descr=""/>
+                    <pic:cNvPicPr>
+                      <a:picLocks noChangeAspect="1" noChangeArrowheads="1"/>
+                    </pic:cNvPicPr>
+                  </pic:nvPicPr>
+                  <pic:blipFill>
+                    <a:blip r:embed="rId7" cstate="none"/>
+                    <a:srcRect/>
+                    <a:stretch>
+                      <a:fillRect/>
+                    </a:stretch>
+                  </pic:blipFill>
+                  <pic:spPr bwMode="auto">
+                    <a:xfrm>
+                      <a:off x="0" y="0"/>
+                      <a:ext cx="4000500" cy="4705350"/>
+                    </a:xfrm>
+                    <a:prstGeom prst="rect">
+                      <a:avLst/>
+                    </a:prstGeom>
+                  </pic:spPr>
+                </pic:pic>
+              </a:graphicData>
+            </a:graphic>
+          </wp:inline>
+        </w:drawing>
+      </w:r>
+    </w:p>
+    <w:p>
+      <w:pPr>
+        <w:spacing w:after="180"/>
+        <w:jc w:val="center"/>
+      </w:pPr>
+      <w:r>
+        <w:rPr>
+          <w:rFonts w:ascii="Calibri" w:cs="Calibri" w:eastAsia="Calibri" w:hAnsi="Calibri"/>
+          <w:i/>
+          <w:iCs/>
+          <w:color w:val="555555"/>
+          <w:sz w:val="19"/>
+          <w:szCs w:val="19"/>
+        </w:rPr>
+        <w:t xml:space="preserve">Evidence: execution of the model comparison (compare_models.py) on the full 82,486-email corpus — Logistic Regression baseline (F1 0.9865) and LinearSVC benchmark replication (F1 0.9916, FP rate 0.0095) against the published [41] result of 0.99.</w:t>
+      </w:r>
+    </w:p>
+    <w:p>
+      <w:pPr>
         <w:pStyle w:val="ListParagraph"/>
         <w:numPr>
           <w:ilvl w:val="0"/>
@@ -1667,7 +1730,7 @@
           <w:sz w:val="28"/>
           <w:szCs w:val="28"/>
         </w:rPr>
-        <w:t xml:space="preserve">6. Relationship to the Part A Literature Review</w:t>
+        <w:t xml:space="preserve">6. Relationship to the Part A Literature Review (by reference number)</w:t>
       </w:r>
     </w:p>
     <w:p>
@@ -1681,9 +1744,454 @@
           <w:sz w:val="22"/>
           <w:szCs w:val="22"/>
         </w:rPr>
-        <w:t xml:space="preserve">The Part A (MIS5203) 40-paper review established the evaluation parameters this project uses: classification accuracy, precision, recall, F1 score, false-positive rate, and detection latency — drawn from deep-learning phishing-email detection studies (CNN-LSTM evaluation on a large legitimate-vs-phishing email corpus with content/header features and latency targets) and transformer-based email detection work, alongside a 2025 survey of phishing detection techniques and datasets in which the Nazario and Enron corpora are canonical.</w:t>
+        <w:t xml:space="preserve">The Part A (MIS5203) reference register [1]–[40] established the evaluation parameters this project uses; the mapping is:</w:t>
       </w:r>
     </w:p>
+    <w:tbl>
+      <w:tblPr>
+        <w:tblW w:type="dxa" w:w="9200"/>
+        <w:tblBorders>
+          <w:top w:val="single" w:color="auto" w:sz="4"/>
+          <w:left w:val="single" w:color="auto" w:sz="4"/>
+          <w:bottom w:val="single" w:color="auto" w:sz="4"/>
+          <w:right w:val="single" w:color="auto" w:sz="4"/>
+          <w:insideH w:val="single" w:color="auto" w:sz="4"/>
+          <w:insideV w:val="single" w:color="auto" w:sz="4"/>
+        </w:tblBorders>
+      </w:tblPr>
+      <w:tblGrid>
+        <w:gridCol w:w="1200"/>
+        <w:gridCol w:w="4700"/>
+        <w:gridCol w:w="3300"/>
+      </w:tblGrid>
+      <w:tr>
+        <w:trPr>
+          <w:tblHeader/>
+        </w:trPr>
+        <w:tc>
+          <w:tcPr>
+            <w:tcW w:type="dxa" w:w="1200"/>
+            <w:shd w:fill="1F4E5F" w:val="clear"/>
+            <w:tcMar>
+              <w:top w:type="dxa" w:w="80"/>
+              <w:left w:type="dxa" w:w="100"/>
+              <w:bottom w:type="dxa" w:w="80"/>
+              <w:right w:type="dxa" w:w="100"/>
+            </w:tcMar>
+          </w:tcPr>
+          <w:p>
+            <w:pPr>
+              <w:spacing w:after="0" w:line="252"/>
+            </w:pPr>
+            <w:r>
+              <w:rPr>
+                <w:rFonts w:ascii="Calibri" w:cs="Calibri" w:eastAsia="Calibri" w:hAnsi="Calibri"/>
+                <w:b/>
+                <w:bCs/>
+                <w:color w:val="FFFFFF"/>
+                <w:sz w:val="20"/>
+                <w:szCs w:val="20"/>
+              </w:rPr>
+              <w:t xml:space="preserve">Part A ref</w:t>
+            </w:r>
+          </w:p>
+        </w:tc>
+        <w:tc>
+          <w:tcPr>
+            <w:tcW w:type="dxa" w:w="4700"/>
+            <w:shd w:fill="1F4E5F" w:val="clear"/>
+            <w:tcMar>
+              <w:top w:type="dxa" w:w="80"/>
+              <w:left w:type="dxa" w:w="100"/>
+              <w:bottom w:type="dxa" w:w="80"/>
+              <w:right w:type="dxa" w:w="100"/>
+            </w:tcMar>
+          </w:tcPr>
+          <w:p>
+            <w:pPr>
+              <w:spacing w:after="0" w:line="252"/>
+            </w:pPr>
+            <w:r>
+              <w:rPr>
+                <w:rFonts w:ascii="Calibri" w:cs="Calibri" w:eastAsia="Calibri" w:hAnsi="Calibri"/>
+                <w:b/>
+                <w:bCs/>
+                <w:color w:val="FFFFFF"/>
+                <w:sz w:val="20"/>
+                <w:szCs w:val="20"/>
+              </w:rPr>
+              <w:t xml:space="preserve">Paper (A. Islam section, 240135)</w:t>
+            </w:r>
+          </w:p>
+        </w:tc>
+        <w:tc>
+          <w:tcPr>
+            <w:tcW w:type="dxa" w:w="3300"/>
+            <w:shd w:fill="1F4E5F" w:val="clear"/>
+            <w:tcMar>
+              <w:top w:type="dxa" w:w="80"/>
+              <w:left w:type="dxa" w:w="100"/>
+              <w:bottom w:type="dxa" w:w="80"/>
+              <w:right w:type="dxa" w:w="100"/>
+            </w:tcMar>
+          </w:tcPr>
+          <w:p>
+            <w:pPr>
+              <w:spacing w:after="0" w:line="252"/>
+            </w:pPr>
+            <w:r>
+              <w:rPr>
+                <w:rFonts w:ascii="Calibri" w:cs="Calibri" w:eastAsia="Calibri" w:hAnsi="Calibri"/>
+                <w:b/>
+                <w:bCs/>
+                <w:color w:val="FFFFFF"/>
+                <w:sz w:val="20"/>
+                <w:szCs w:val="20"/>
+              </w:rPr>
+              <w:t xml:space="preserve">Parameter contributed to SEDAS</w:t>
+            </w:r>
+          </w:p>
+        </w:tc>
+      </w:tr>
+      <w:tr>
+        <w:trPr>
+          <w:tblHeader w:val="false"/>
+        </w:trPr>
+        <w:tc>
+          <w:tcPr>
+            <w:tcW w:type="dxa" w:w="1200"/>
+            <w:tcMar>
+              <w:top w:type="dxa" w:w="80"/>
+              <w:left w:type="dxa" w:w="100"/>
+              <w:bottom w:type="dxa" w:w="80"/>
+              <w:right w:type="dxa" w:w="100"/>
+            </w:tcMar>
+          </w:tcPr>
+          <w:p>
+            <w:pPr>
+              <w:spacing w:after="0" w:line="252"/>
+            </w:pPr>
+            <w:r>
+              <w:rPr>
+                <w:rFonts w:ascii="Calibri" w:cs="Calibri" w:eastAsia="Calibri" w:hAnsi="Calibri"/>
+                <w:b w:val="false"/>
+                <w:bCs w:val="false"/>
+                <w:sz w:val="19"/>
+                <w:szCs w:val="19"/>
+              </w:rPr>
+              <w:t xml:space="preserve">[3]</w:t>
+            </w:r>
+          </w:p>
+        </w:tc>
+        <w:tc>
+          <w:tcPr>
+            <w:tcW w:type="dxa" w:w="4700"/>
+            <w:tcMar>
+              <w:top w:type="dxa" w:w="80"/>
+              <w:left w:type="dxa" w:w="100"/>
+              <w:bottom w:type="dxa" w:w="80"/>
+              <w:right w:type="dxa" w:w="100"/>
+            </w:tcMar>
+          </w:tcPr>
+          <w:p>
+            <w:pPr>
+              <w:spacing w:after="0" w:line="252"/>
+            </w:pPr>
+            <w:r>
+              <w:rPr>
+                <w:rFonts w:ascii="Calibri" w:cs="Calibri" w:eastAsia="Calibri" w:hAnsi="Calibri"/>
+                <w:b w:val="false"/>
+                <w:bCs w:val="false"/>
+                <w:sz w:val="19"/>
+                <w:szCs w:val="19"/>
+              </w:rPr>
+              <w:t xml:space="preserve">Investigation of Phishing Susceptibility with Explainable Artificial Intelligence (Future Internet, 2024)</w:t>
+            </w:r>
+          </w:p>
+        </w:tc>
+        <w:tc>
+          <w:tcPr>
+            <w:tcW w:type="dxa" w:w="3300"/>
+            <w:tcMar>
+              <w:top w:type="dxa" w:w="80"/>
+              <w:left w:type="dxa" w:w="100"/>
+              <w:bottom w:type="dxa" w:w="80"/>
+              <w:right w:type="dxa" w:w="100"/>
+            </w:tcMar>
+          </w:tcPr>
+          <w:p>
+            <w:pPr>
+              <w:spacing w:after="0" w:line="252"/>
+            </w:pPr>
+            <w:r>
+              <w:rPr>
+                <w:rFonts w:ascii="Calibri" w:cs="Calibri" w:eastAsia="Calibri" w:hAnsi="Calibri"/>
+                <w:b w:val="false"/>
+                <w:bCs w:val="false"/>
+                <w:sz w:val="19"/>
+                <w:szCs w:val="19"/>
+              </w:rPr>
+              <w:t xml:space="preserve">Explainability requirement — implemented as top-indicator output (FR-02); mirrors XAI/LIME in [41]</w:t>
+            </w:r>
+          </w:p>
+        </w:tc>
+      </w:tr>
+      <w:tr>
+        <w:trPr>
+          <w:tblHeader w:val="false"/>
+        </w:trPr>
+        <w:tc>
+          <w:tcPr>
+            <w:tcW w:type="dxa" w:w="1200"/>
+            <w:shd w:fill="F4F8FA" w:val="clear"/>
+            <w:tcMar>
+              <w:top w:type="dxa" w:w="80"/>
+              <w:left w:type="dxa" w:w="100"/>
+              <w:bottom w:type="dxa" w:w="80"/>
+              <w:right w:type="dxa" w:w="100"/>
+            </w:tcMar>
+          </w:tcPr>
+          <w:p>
+            <w:pPr>
+              <w:spacing w:after="0" w:line="252"/>
+            </w:pPr>
+            <w:r>
+              <w:rPr>
+                <w:rFonts w:ascii="Calibri" w:cs="Calibri" w:eastAsia="Calibri" w:hAnsi="Calibri"/>
+                <w:b w:val="false"/>
+                <w:bCs w:val="false"/>
+                <w:sz w:val="19"/>
+                <w:szCs w:val="19"/>
+              </w:rPr>
+              <w:t xml:space="preserve">[7]</w:t>
+            </w:r>
+          </w:p>
+        </w:tc>
+        <w:tc>
+          <w:tcPr>
+            <w:tcW w:type="dxa" w:w="4700"/>
+            <w:shd w:fill="F4F8FA" w:val="clear"/>
+            <w:tcMar>
+              <w:top w:type="dxa" w:w="80"/>
+              <w:left w:type="dxa" w:w="100"/>
+              <w:bottom w:type="dxa" w:w="80"/>
+              <w:right w:type="dxa" w:w="100"/>
+            </w:tcMar>
+          </w:tcPr>
+          <w:p>
+            <w:pPr>
+              <w:spacing w:after="0" w:line="252"/>
+            </w:pPr>
+            <w:r>
+              <w:rPr>
+                <w:rFonts w:ascii="Calibri" w:cs="Calibri" w:eastAsia="Calibri" w:hAnsi="Calibri"/>
+                <w:b w:val="false"/>
+                <w:bCs w:val="false"/>
+                <w:sz w:val="19"/>
+                <w:szCs w:val="19"/>
+              </w:rPr>
+              <w:t xml:space="preserve">A Survey on Phishing Attack Taxonomy, Detection Techniques, Datasets, and Security Measures (J. Applied Security Research, 2025)</w:t>
+            </w:r>
+          </w:p>
+        </w:tc>
+        <w:tc>
+          <w:tcPr>
+            <w:tcW w:type="dxa" w:w="3300"/>
+            <w:shd w:fill="F4F8FA" w:val="clear"/>
+            <w:tcMar>
+              <w:top w:type="dxa" w:w="80"/>
+              <w:left w:type="dxa" w:w="100"/>
+              <w:bottom w:type="dxa" w:w="80"/>
+              <w:right w:type="dxa" w:w="100"/>
+            </w:tcMar>
+          </w:tcPr>
+          <w:p>
+            <w:pPr>
+              <w:spacing w:after="0" w:line="252"/>
+            </w:pPr>
+            <w:r>
+              <w:rPr>
+                <w:rFonts w:ascii="Calibri" w:cs="Calibri" w:eastAsia="Calibri" w:hAnsi="Calibri"/>
+                <w:b w:val="false"/>
+                <w:bCs w:val="false"/>
+                <w:sz w:val="19"/>
+                <w:szCs w:val="19"/>
+              </w:rPr>
+              <w:t xml:space="preserve">Dataset landscape (Nazario/Enron corpora canonical) and detection-metric framework; Part A comparative analysis under [7] (CNN-LSTM email detection, ~98.2% accuracy, 1.8% FP, 50 ms latency) anchored the Part A KPIs</w:t>
+            </w:r>
+          </w:p>
+        </w:tc>
+      </w:tr>
+      <w:tr>
+        <w:trPr>
+          <w:tblHeader w:val="false"/>
+        </w:trPr>
+        <w:tc>
+          <w:tcPr>
+            <w:tcW w:type="dxa" w:w="1200"/>
+            <w:tcMar>
+              <w:top w:type="dxa" w:w="80"/>
+              <w:left w:type="dxa" w:w="100"/>
+              <w:bottom w:type="dxa" w:w="80"/>
+              <w:right w:type="dxa" w:w="100"/>
+            </w:tcMar>
+          </w:tcPr>
+          <w:p>
+            <w:pPr>
+              <w:spacing w:after="0" w:line="252"/>
+            </w:pPr>
+            <w:r>
+              <w:rPr>
+                <w:rFonts w:ascii="Calibri" w:cs="Calibri" w:eastAsia="Calibri" w:hAnsi="Calibri"/>
+                <w:b w:val="false"/>
+                <w:bCs w:val="false"/>
+                <w:sz w:val="19"/>
+                <w:szCs w:val="19"/>
+              </w:rPr>
+              <w:t xml:space="preserve">[8]</w:t>
+            </w:r>
+          </w:p>
+        </w:tc>
+        <w:tc>
+          <w:tcPr>
+            <w:tcW w:type="dxa" w:w="4700"/>
+            <w:tcMar>
+              <w:top w:type="dxa" w:w="80"/>
+              <w:left w:type="dxa" w:w="100"/>
+              <w:bottom w:type="dxa" w:w="80"/>
+              <w:right w:type="dxa" w:w="100"/>
+            </w:tcMar>
+          </w:tcPr>
+          <w:p>
+            <w:pPr>
+              <w:spacing w:after="0" w:line="252"/>
+            </w:pPr>
+            <w:r>
+              <w:rPr>
+                <w:rFonts w:ascii="Calibri" w:cs="Calibri" w:eastAsia="Calibri" w:hAnsi="Calibri"/>
+                <w:b w:val="false"/>
+                <w:bCs w:val="false"/>
+                <w:sz w:val="19"/>
+                <w:szCs w:val="19"/>
+              </w:rPr>
+              <w:t xml:space="preserve">Staying ahead of phishers: a review of recent advances and emerging methodologies in phishing detection (Artificial Intelligence Review, 2024)</w:t>
+            </w:r>
+          </w:p>
+        </w:tc>
+        <w:tc>
+          <w:tcPr>
+            <w:tcW w:type="dxa" w:w="3300"/>
+            <w:tcMar>
+              <w:top w:type="dxa" w:w="80"/>
+              <w:left w:type="dxa" w:w="100"/>
+              <w:bottom w:type="dxa" w:w="80"/>
+              <w:right w:type="dxa" w:w="100"/>
+            </w:tcMar>
+          </w:tcPr>
+          <w:p>
+            <w:pPr>
+              <w:spacing w:after="0" w:line="252"/>
+            </w:pPr>
+            <w:r>
+              <w:rPr>
+                <w:rFonts w:ascii="Calibri" w:cs="Calibri" w:eastAsia="Calibri" w:hAnsi="Calibri"/>
+                <w:b w:val="false"/>
+                <w:bCs w:val="false"/>
+                <w:sz w:val="19"/>
+                <w:szCs w:val="19"/>
+              </w:rPr>
+              <w:t xml:space="preserve">Detection-methodology lineage, incl. transformer-based approaches — basis for the DistilBERT extension</w:t>
+            </w:r>
+          </w:p>
+        </w:tc>
+      </w:tr>
+      <w:tr>
+        <w:trPr>
+          <w:tblHeader w:val="false"/>
+        </w:trPr>
+        <w:tc>
+          <w:tcPr>
+            <w:tcW w:type="dxa" w:w="1200"/>
+            <w:shd w:fill="F4F8FA" w:val="clear"/>
+            <w:tcMar>
+              <w:top w:type="dxa" w:w="80"/>
+              <w:left w:type="dxa" w:w="100"/>
+              <w:bottom w:type="dxa" w:w="80"/>
+              <w:right w:type="dxa" w:w="100"/>
+            </w:tcMar>
+          </w:tcPr>
+          <w:p>
+            <w:pPr>
+              <w:spacing w:after="0" w:line="252"/>
+            </w:pPr>
+            <w:r>
+              <w:rPr>
+                <w:rFonts w:ascii="Calibri" w:cs="Calibri" w:eastAsia="Calibri" w:hAnsi="Calibri"/>
+                <w:b w:val="false"/>
+                <w:bCs w:val="false"/>
+                <w:sz w:val="19"/>
+                <w:szCs w:val="19"/>
+              </w:rPr>
+              <w:t xml:space="preserve">[41] (new, Part B)</w:t>
+            </w:r>
+          </w:p>
+        </w:tc>
+        <w:tc>
+          <w:tcPr>
+            <w:tcW w:type="dxa" w:w="4700"/>
+            <w:shd w:fill="F4F8FA" w:val="clear"/>
+            <w:tcMar>
+              <w:top w:type="dxa" w:w="80"/>
+              <w:left w:type="dxa" w:w="100"/>
+              <w:bottom w:type="dxa" w:w="80"/>
+              <w:right w:type="dxa" w:w="100"/>
+            </w:tcMar>
+          </w:tcPr>
+          <w:p>
+            <w:pPr>
+              <w:spacing w:after="0" w:line="252"/>
+            </w:pPr>
+            <w:r>
+              <w:rPr>
+                <w:rFonts w:ascii="Calibri" w:cs="Calibri" w:eastAsia="Calibri" w:hAnsi="Calibri"/>
+                <w:b w:val="false"/>
+                <w:bCs w:val="false"/>
+                <w:sz w:val="19"/>
+                <w:szCs w:val="19"/>
+              </w:rPr>
+              <w:t xml:space="preserve">Al-Subaiey et al. (2024), Computers and Electrical Engineering 120:109625</w:t>
+            </w:r>
+          </w:p>
+        </w:tc>
+        <w:tc>
+          <w:tcPr>
+            <w:tcW w:type="dxa" w:w="3300"/>
+            <w:shd w:fill="F4F8FA" w:val="clear"/>
+            <w:tcMar>
+              <w:top w:type="dxa" w:w="80"/>
+              <w:left w:type="dxa" w:w="100"/>
+              <w:bottom w:type="dxa" w:w="80"/>
+              <w:right w:type="dxa" w:w="100"/>
+            </w:tcMar>
+          </w:tcPr>
+          <w:p>
+            <w:pPr>
+              <w:spacing w:after="0" w:line="252"/>
+            </w:pPr>
+            <w:r>
+              <w:rPr>
+                <w:rFonts w:ascii="Calibri" w:cs="Calibri" w:eastAsia="Calibri" w:hAnsi="Calibri"/>
+                <w:b w:val="false"/>
+                <w:bCs w:val="false"/>
+                <w:sz w:val="19"/>
+                <w:szCs w:val="19"/>
+              </w:rPr>
+              <w:t xml:space="preserve">Exact dataset match — same 82.5k corpus; published TF-IDF+SVM F1 = 0.99 benchmark, replicated by SEDAS at 0.9916</w:t>
+            </w:r>
+          </w:p>
+        </w:tc>
+      </w:tr>
+    </w:tbl>
     <w:p>
       <w:pPr>
         <w:spacing w:after="130" w:line="276"/>
@@ -1695,7 +2203,7 @@
           <w:sz w:val="22"/>
           <w:szCs w:val="22"/>
         </w:rPr>
-        <w:t xml:space="preserve">Part B refines this foundation by identifying the source publication of the exact dataset in use (Al-Subaiey et al., 2024). The project therefore satisfies both benchmark conditions discussed with the supervisor: the parameters are anchored in the Part A literature, and the dataset is identical to a recent peer-reviewed study with published results — enabling a direct like-for-like comparison on the same corpus.</w:t>
+        <w:t xml:space="preserve">Part B therefore satisfies both benchmark conditions discussed with the supervisor: the evaluation parameters are anchored in the Part A register ([3], [7], [8]), and the dataset is identical to a recent peer-reviewed study with published results ([41]) — enabling a direct like-for-like comparison on the same corpus. Introducing [41] during implementation is a documented Part B refinement (ULO 1): the Part A review anchored the parameters; the implementation phase identified the dataset's source publication as the exact benchmark.</w:t>
       </w:r>
     </w:p>
     <w:sectPr>

</xml_diff>